<commit_message>
Sesión 4 en el aula con repaso; sesión 5 pasa al martes 13
</commit_message>
<xml_diff>
--- a/sesion5/Laboratorio3_comparacion_EST331.docx
+++ b/sesion5/Laboratorio3_comparacion_EST331.docx
@@ -3,6 +3,11 @@
 <w:document xmlns:wpc="http://schemas.microsoft.com/office/word/2010/wordprocessingCanvas" xmlns:cx="http://schemas.microsoft.com/office/drawing/2014/chartex" xmlns:cx1="http://schemas.microsoft.com/office/drawing/2015/9/8/chartex" xmlns:cx2="http://schemas.microsoft.com/office/drawing/2015/10/21/chartex" xmlns:cx3="http://schemas.microsoft.com/office/drawing/2016/5/9/chartex" xmlns:cx4="http://schemas.microsoft.com/office/drawing/2016/5/10/chartex" xmlns:cx5="http://schemas.microsoft.com/office/drawing/2016/5/11/chartex" xmlns:cx6="http://schemas.microsoft.com/office/drawing/2016/5/12/chartex" xmlns:cx7="http://schemas.microsoft.com/office/drawing/2016/5/13/chartex" xmlns:cx8="http://schemas.microsoft.com/office/drawing/2016/5/14/chartex" xmlns:mc="http://schemas.openxmlformats.org/markup-compatibility/2006" xmlns:aink="http://schemas.microsoft.com/office/drawing/2016/ink" xmlns:am3d="http://schemas.microsoft.com/office/drawing/2017/model3d" xmlns:o="urn:schemas-microsoft-com:office:office" xmlns:oel="http://schemas.microsoft.com/office/2019/extlst" xmlns:r="http://schemas.openxmlformats.org/officeDocument/2006/relationships" xmlns:m="http://schemas.openxmlformats.org/officeDocument/2006/math" xmlns:v="urn:schemas-microsoft-com:vml" xmlns:wp14="http://schemas.microsoft.com/office/word/2010/wordprocessingDrawing" xmlns:wp="http://schemas.openxmlformats.org/drawingml/2006/wordprocessingDrawing" xmlns:w10="urn:schemas-microsoft-com:office:word" xmlns:w="http://schemas.openxmlformats.org/wordprocessingml/2006/main" xmlns:w14="http://schemas.microsoft.com/office/word/2010/wordml" xmlns:w15="http://schemas.microsoft.com/office/word/2012/wordml" xmlns:w16cex="http://schemas.microsoft.com/office/word/2018/wordml/cex" xmlns:w16cid="http://schemas.microsoft.com/office/word/2016/wordml/cid" xmlns:w16="http://schemas.microsoft.com/office/word/2018/wordml" xmlns:w16du="http://schemas.microsoft.com/office/word/2023/wordml/word16du" xmlns:w16sdtdh="http://schemas.microsoft.com/office/word/2020/wordml/sdtdatahash" xmlns:w16sdtfl="http://schemas.microsoft.com/office/word/2024/wordml/sdtformatlock" xmlns:w16se="http://schemas.microsoft.com/office/word/2015/wordml/symex" xmlns:wpg="http://schemas.microsoft.com/office/word/2010/wordprocessingGroup" xmlns:wpi="http://schemas.microsoft.com/office/word/2010/wordprocessingInk" xmlns:wne="http://schemas.microsoft.com/office/word/2006/wordml" xmlns:wps="http://schemas.microsoft.com/office/word/2010/wordprocessingShape" mc:Ignorable="w14 w15 w16se w16cid w16 w16cex w16sdtdh w16sdtfl w16du wp14">
   <w:body>
     <w:p>
+      <w:pPr>
+        <w:rPr>
+          <w:rFonts w:hint="eastAsia"/>
+        </w:rPr>
+      </w:pPr>
       <w:r>
         <w:rPr>
           <w:b/>
@@ -15,6 +20,9 @@
     <w:p>
       <w:pPr>
         <w:keepNext/>
+        <w:rPr>
+          <w:rFonts w:hint="eastAsia"/>
+        </w:rPr>
       </w:pPr>
       <w:r>
         <w:rPr>
@@ -28,6 +36,9 @@
     <w:p>
       <w:pPr>
         <w:spacing w:after="80"/>
+        <w:rPr>
+          <w:rFonts w:hint="eastAsia"/>
+        </w:rPr>
       </w:pPr>
       <w:r>
         <w:rPr>
@@ -35,7 +46,7 @@
           <w:color w:val="676B5E"/>
           <w:sz w:val="19"/>
         </w:rPr>
-        <w:t>Equipos de hasta tres. Se llena a mano o en este archivo y se entrega en PDF en el aula virtual hasta el lunes 12 de octubre, 23:59. Si trabajan en equipo, cada integrante sube el mismo PDF. Simulación: vl4dimr.github.io/est331/simulaciones/comparacion.html</w:t>
+        <w:t>Equipos de hasta tres. Se llena a mano o en este archivo y se entrega en PDF en el aula virtual hasta el lunes 19 de octubre, 23:59. Si trabajan en equipo, cada integrante sube el mismo PDF. Simulación: vl4dimr.github.io/est331/simulaciones/comparacion.html</w:t>
       </w:r>
     </w:p>
     <w:tbl>
@@ -61,6 +72,9 @@
           <w:p>
             <w:pPr>
               <w:keepNext/>
+              <w:rPr>
+                <w:rFonts w:hint="eastAsia"/>
+              </w:rPr>
             </w:pPr>
             <w:r>
               <w:rPr>
@@ -80,6 +94,9 @@
           <w:p>
             <w:pPr>
               <w:keepNext/>
+              <w:rPr>
+                <w:rFonts w:hint="eastAsia"/>
+              </w:rPr>
             </w:pPr>
             <w:r>
               <w:rPr>
@@ -104,6 +121,9 @@
           <w:p>
             <w:pPr>
               <w:keepNext/>
+              <w:rPr>
+                <w:rFonts w:hint="eastAsia"/>
+              </w:rPr>
             </w:pPr>
             <w:r>
               <w:rPr>
@@ -122,6 +142,9 @@
           <w:p>
             <w:pPr>
               <w:keepNext/>
+              <w:rPr>
+                <w:rFonts w:hint="eastAsia"/>
+              </w:rPr>
             </w:pPr>
           </w:p>
         </w:tc>
@@ -138,6 +161,9 @@
           <w:p>
             <w:pPr>
               <w:keepNext/>
+              <w:rPr>
+                <w:rFonts w:hint="eastAsia"/>
+              </w:rPr>
             </w:pPr>
             <w:r>
               <w:rPr>
@@ -156,6 +182,9 @@
           <w:p>
             <w:pPr>
               <w:keepNext/>
+              <w:rPr>
+                <w:rFonts w:hint="eastAsia"/>
+              </w:rPr>
             </w:pPr>
           </w:p>
         </w:tc>
@@ -170,6 +199,11 @@
             <w:tcW w:w="7824" w:type="dxa"/>
           </w:tcPr>
           <w:p>
+            <w:pPr>
+              <w:rPr>
+                <w:rFonts w:hint="eastAsia"/>
+              </w:rPr>
+            </w:pPr>
             <w:r>
               <w:rPr>
                 <w:b/>
@@ -184,16 +218,30 @@
           <w:tcPr>
             <w:tcW w:w="2268" w:type="dxa"/>
           </w:tcPr>
-          <w:p/>
+          <w:p>
+            <w:pPr>
+              <w:rPr>
+                <w:rFonts w:hint="eastAsia"/>
+              </w:rPr>
+            </w:pPr>
+          </w:p>
         </w:tc>
       </w:tr>
     </w:tbl>
     <w:p>
       <w:pPr>
         <w:spacing w:after="20"/>
+        <w:rPr>
+          <w:rFonts w:hint="eastAsia"/>
+        </w:rPr>
       </w:pPr>
     </w:p>
     <w:p>
+      <w:pPr>
+        <w:rPr>
+          <w:rFonts w:hint="eastAsia"/>
+        </w:rPr>
+      </w:pPr>
       <w:r>
         <w:rPr>
           <w:b/>
@@ -211,6 +259,11 @@
       </w:r>
     </w:p>
     <w:p>
+      <w:pPr>
+        <w:rPr>
+          <w:rFonts w:hint="eastAsia"/>
+        </w:rPr>
+      </w:pPr>
       <w:r>
         <w:rPr>
           <w:noProof/>
@@ -255,6 +308,9 @@
     <w:p>
       <w:pPr>
         <w:spacing w:after="40"/>
+        <w:rPr>
+          <w:rFonts w:hint="eastAsia"/>
+        </w:rPr>
       </w:pPr>
       <w:r>
         <w:rPr>
@@ -269,6 +325,9 @@
       <w:pPr>
         <w:keepNext/>
         <w:spacing w:before="80"/>
+        <w:rPr>
+          <w:rFonts w:hint="eastAsia"/>
+        </w:rPr>
       </w:pPr>
       <w:r>
         <w:rPr>
@@ -282,6 +341,9 @@
     <w:p>
       <w:pPr>
         <w:spacing w:after="80"/>
+        <w:rPr>
+          <w:rFonts w:hint="eastAsia"/>
+        </w:rPr>
       </w:pPr>
       <w:r>
         <w:rPr>
@@ -318,6 +380,9 @@
           <w:p>
             <w:pPr>
               <w:keepNext/>
+              <w:rPr>
+                <w:rFonts w:hint="eastAsia"/>
+              </w:rPr>
             </w:pPr>
             <w:r>
               <w:rPr>
@@ -337,6 +402,9 @@
           <w:p>
             <w:pPr>
               <w:keepNext/>
+              <w:rPr>
+                <w:rFonts w:hint="eastAsia"/>
+              </w:rPr>
             </w:pPr>
             <w:r>
               <w:rPr>
@@ -356,6 +424,9 @@
           <w:p>
             <w:pPr>
               <w:keepNext/>
+              <w:rPr>
+                <w:rFonts w:hint="eastAsia"/>
+              </w:rPr>
             </w:pPr>
             <w:r>
               <w:rPr>
@@ -375,6 +446,9 @@
           <w:p>
             <w:pPr>
               <w:keepNext/>
+              <w:rPr>
+                <w:rFonts w:hint="eastAsia"/>
+              </w:rPr>
             </w:pPr>
             <w:r>
               <w:rPr>
@@ -394,6 +468,9 @@
           <w:p>
             <w:pPr>
               <w:keepNext/>
+              <w:rPr>
+                <w:rFonts w:hint="eastAsia"/>
+              </w:rPr>
             </w:pPr>
             <w:r>
               <w:rPr>
@@ -418,6 +495,9 @@
           <w:p>
             <w:pPr>
               <w:keepNext/>
+              <w:rPr>
+                <w:rFonts w:hint="eastAsia"/>
+              </w:rPr>
             </w:pPr>
             <w:r>
               <w:rPr>
@@ -436,6 +516,9 @@
           <w:p>
             <w:pPr>
               <w:keepNext/>
+              <w:rPr>
+                <w:rFonts w:hint="eastAsia"/>
+              </w:rPr>
             </w:pPr>
           </w:p>
         </w:tc>
@@ -446,6 +529,9 @@
           <w:p>
             <w:pPr>
               <w:keepNext/>
+              <w:rPr>
+                <w:rFonts w:hint="eastAsia"/>
+              </w:rPr>
             </w:pPr>
           </w:p>
         </w:tc>
@@ -456,6 +542,9 @@
           <w:p>
             <w:pPr>
               <w:keepNext/>
+              <w:rPr>
+                <w:rFonts w:hint="eastAsia"/>
+              </w:rPr>
             </w:pPr>
           </w:p>
         </w:tc>
@@ -466,6 +555,9 @@
           <w:p>
             <w:pPr>
               <w:keepNext/>
+              <w:rPr>
+                <w:rFonts w:hint="eastAsia"/>
+              </w:rPr>
             </w:pPr>
           </w:p>
         </w:tc>
@@ -482,6 +574,9 @@
           <w:p>
             <w:pPr>
               <w:keepNext/>
+              <w:rPr>
+                <w:rFonts w:hint="eastAsia"/>
+              </w:rPr>
             </w:pPr>
             <w:r>
               <w:rPr>
@@ -500,6 +595,9 @@
           <w:p>
             <w:pPr>
               <w:keepNext/>
+              <w:rPr>
+                <w:rFonts w:hint="eastAsia"/>
+              </w:rPr>
             </w:pPr>
           </w:p>
         </w:tc>
@@ -510,6 +608,9 @@
           <w:p>
             <w:pPr>
               <w:keepNext/>
+              <w:rPr>
+                <w:rFonts w:hint="eastAsia"/>
+              </w:rPr>
             </w:pPr>
           </w:p>
         </w:tc>
@@ -520,6 +621,9 @@
           <w:p>
             <w:pPr>
               <w:keepNext/>
+              <w:rPr>
+                <w:rFonts w:hint="eastAsia"/>
+              </w:rPr>
             </w:pPr>
           </w:p>
         </w:tc>
@@ -530,6 +634,9 @@
           <w:p>
             <w:pPr>
               <w:keepNext/>
+              <w:rPr>
+                <w:rFonts w:hint="eastAsia"/>
+              </w:rPr>
             </w:pPr>
           </w:p>
         </w:tc>
@@ -544,6 +651,11 @@
             <w:tcW w:w="1701" w:type="dxa"/>
           </w:tcPr>
           <w:p>
+            <w:pPr>
+              <w:rPr>
+                <w:rFonts w:hint="eastAsia"/>
+              </w:rPr>
+            </w:pPr>
             <w:r>
               <w:rPr>
                 <w:b/>
@@ -558,34 +670,66 @@
           <w:tcPr>
             <w:tcW w:w="1644" w:type="dxa"/>
           </w:tcPr>
-          <w:p/>
+          <w:p>
+            <w:pPr>
+              <w:rPr>
+                <w:rFonts w:hint="eastAsia"/>
+              </w:rPr>
+            </w:pPr>
+          </w:p>
         </w:tc>
         <w:tc>
           <w:tcPr>
             <w:tcW w:w="1757" w:type="dxa"/>
           </w:tcPr>
-          <w:p/>
+          <w:p>
+            <w:pPr>
+              <w:rPr>
+                <w:rFonts w:hint="eastAsia"/>
+              </w:rPr>
+            </w:pPr>
+          </w:p>
         </w:tc>
         <w:tc>
           <w:tcPr>
             <w:tcW w:w="2608" w:type="dxa"/>
           </w:tcPr>
-          <w:p/>
+          <w:p>
+            <w:pPr>
+              <w:rPr>
+                <w:rFonts w:hint="eastAsia"/>
+              </w:rPr>
+            </w:pPr>
+          </w:p>
         </w:tc>
         <w:tc>
           <w:tcPr>
             <w:tcW w:w="2381" w:type="dxa"/>
           </w:tcPr>
-          <w:p/>
+          <w:p>
+            <w:pPr>
+              <w:rPr>
+                <w:rFonts w:hint="eastAsia"/>
+              </w:rPr>
+            </w:pPr>
+          </w:p>
         </w:tc>
       </w:tr>
     </w:tbl>
     <w:p>
       <w:pPr>
         <w:spacing w:after="20"/>
+        <w:rPr>
+          <w:rFonts w:hint="eastAsia"/>
+        </w:rPr>
       </w:pPr>
     </w:p>
     <w:p>
+      <w:pPr>
+        <w:rPr>
+          <w:rFonts w:hint="eastAsia"/>
+        </w:rPr>
+      </w:pPr>
       <w:r>
         <w:rPr>
           <w:b/>
@@ -620,16 +764,30 @@
           <w:tcPr>
             <w:tcW w:w="10091" w:type="dxa"/>
           </w:tcPr>
-          <w:p/>
+          <w:p>
+            <w:pPr>
+              <w:rPr>
+                <w:rFonts w:hint="eastAsia"/>
+              </w:rPr>
+            </w:pPr>
+          </w:p>
         </w:tc>
       </w:tr>
     </w:tbl>
     <w:p>
       <w:pPr>
         <w:spacing w:after="20"/>
+        <w:rPr>
+          <w:rFonts w:hint="eastAsia"/>
+        </w:rPr>
       </w:pPr>
     </w:p>
     <w:p>
+      <w:pPr>
+        <w:rPr>
+          <w:rFonts w:hint="eastAsia"/>
+        </w:rPr>
+      </w:pPr>
       <w:r>
         <w:br w:type="page"/>
       </w:r>
@@ -637,6 +795,9 @@
     <w:p>
       <w:pPr>
         <w:keepNext/>
+        <w:rPr>
+          <w:rFonts w:hint="eastAsia"/>
+        </w:rPr>
       </w:pPr>
       <w:r>
         <w:rPr>
@@ -649,6 +810,11 @@
       </w:r>
     </w:p>
     <w:p>
+      <w:pPr>
+        <w:rPr>
+          <w:rFonts w:hint="eastAsia"/>
+        </w:rPr>
+      </w:pPr>
       <w:r>
         <w:rPr>
           <w:b/>
@@ -692,6 +858,9 @@
           <w:p>
             <w:pPr>
               <w:keepNext/>
+              <w:rPr>
+                <w:rFonts w:hint="eastAsia"/>
+              </w:rPr>
             </w:pPr>
             <w:r>
               <w:rPr>
@@ -711,6 +880,9 @@
           <w:p>
             <w:pPr>
               <w:keepNext/>
+              <w:rPr>
+                <w:rFonts w:hint="eastAsia"/>
+              </w:rPr>
             </w:pPr>
             <w:r>
               <w:rPr>
@@ -730,6 +902,9 @@
           <w:p>
             <w:pPr>
               <w:keepNext/>
+              <w:rPr>
+                <w:rFonts w:hint="eastAsia"/>
+              </w:rPr>
             </w:pPr>
             <w:r>
               <w:rPr>
@@ -749,6 +924,9 @@
           <w:p>
             <w:pPr>
               <w:keepNext/>
+              <w:rPr>
+                <w:rFonts w:hint="eastAsia"/>
+              </w:rPr>
             </w:pPr>
             <w:r>
               <w:rPr>
@@ -768,6 +946,9 @@
           <w:p>
             <w:pPr>
               <w:keepNext/>
+              <w:rPr>
+                <w:rFonts w:hint="eastAsia"/>
+              </w:rPr>
             </w:pPr>
             <w:r>
               <w:rPr>
@@ -787,6 +968,9 @@
           <w:p>
             <w:pPr>
               <w:keepNext/>
+              <w:rPr>
+                <w:rFonts w:hint="eastAsia"/>
+              </w:rPr>
             </w:pPr>
             <w:r>
               <w:rPr>
@@ -811,6 +995,9 @@
           <w:p>
             <w:pPr>
               <w:keepNext/>
+              <w:rPr>
+                <w:rFonts w:hint="eastAsia"/>
+              </w:rPr>
             </w:pPr>
             <w:r>
               <w:rPr>
@@ -829,6 +1016,9 @@
           <w:p>
             <w:pPr>
               <w:keepNext/>
+              <w:rPr>
+                <w:rFonts w:hint="eastAsia"/>
+              </w:rPr>
             </w:pPr>
             <w:r>
               <w:rPr>
@@ -846,6 +1036,9 @@
           <w:p>
             <w:pPr>
               <w:keepNext/>
+              <w:rPr>
+                <w:rFonts w:hint="eastAsia"/>
+              </w:rPr>
             </w:pPr>
           </w:p>
         </w:tc>
@@ -856,6 +1049,9 @@
           <w:p>
             <w:pPr>
               <w:keepNext/>
+              <w:rPr>
+                <w:rFonts w:hint="eastAsia"/>
+              </w:rPr>
             </w:pPr>
           </w:p>
         </w:tc>
@@ -866,6 +1062,9 @@
           <w:p>
             <w:pPr>
               <w:keepNext/>
+              <w:rPr>
+                <w:rFonts w:hint="eastAsia"/>
+              </w:rPr>
             </w:pPr>
           </w:p>
         </w:tc>
@@ -876,6 +1075,9 @@
           <w:p>
             <w:pPr>
               <w:keepNext/>
+              <w:rPr>
+                <w:rFonts w:hint="eastAsia"/>
+              </w:rPr>
             </w:pPr>
           </w:p>
         </w:tc>
@@ -892,6 +1094,9 @@
           <w:p>
             <w:pPr>
               <w:keepNext/>
+              <w:rPr>
+                <w:rFonts w:hint="eastAsia"/>
+              </w:rPr>
             </w:pPr>
           </w:p>
         </w:tc>
@@ -902,6 +1107,9 @@
           <w:p>
             <w:pPr>
               <w:keepNext/>
+              <w:rPr>
+                <w:rFonts w:hint="eastAsia"/>
+              </w:rPr>
             </w:pPr>
             <w:r>
               <w:rPr>
@@ -919,6 +1127,9 @@
           <w:p>
             <w:pPr>
               <w:keepNext/>
+              <w:rPr>
+                <w:rFonts w:hint="eastAsia"/>
+              </w:rPr>
             </w:pPr>
           </w:p>
         </w:tc>
@@ -929,6 +1140,9 @@
           <w:p>
             <w:pPr>
               <w:keepNext/>
+              <w:rPr>
+                <w:rFonts w:hint="eastAsia"/>
+              </w:rPr>
             </w:pPr>
           </w:p>
         </w:tc>
@@ -939,6 +1153,9 @@
           <w:p>
             <w:pPr>
               <w:keepNext/>
+              <w:rPr>
+                <w:rFonts w:hint="eastAsia"/>
+              </w:rPr>
             </w:pPr>
           </w:p>
         </w:tc>
@@ -949,6 +1166,9 @@
           <w:p>
             <w:pPr>
               <w:keepNext/>
+              <w:rPr>
+                <w:rFonts w:hint="eastAsia"/>
+              </w:rPr>
             </w:pPr>
           </w:p>
         </w:tc>
@@ -965,6 +1185,9 @@
           <w:p>
             <w:pPr>
               <w:keepNext/>
+              <w:rPr>
+                <w:rFonts w:hint="eastAsia"/>
+              </w:rPr>
             </w:pPr>
           </w:p>
         </w:tc>
@@ -975,6 +1198,9 @@
           <w:p>
             <w:pPr>
               <w:keepNext/>
+              <w:rPr>
+                <w:rFonts w:hint="eastAsia"/>
+              </w:rPr>
             </w:pPr>
             <w:r>
               <w:rPr>
@@ -992,6 +1218,9 @@
           <w:p>
             <w:pPr>
               <w:keepNext/>
+              <w:rPr>
+                <w:rFonts w:hint="eastAsia"/>
+              </w:rPr>
             </w:pPr>
           </w:p>
         </w:tc>
@@ -1002,6 +1231,9 @@
           <w:p>
             <w:pPr>
               <w:keepNext/>
+              <w:rPr>
+                <w:rFonts w:hint="eastAsia"/>
+              </w:rPr>
             </w:pPr>
           </w:p>
         </w:tc>
@@ -1012,6 +1244,9 @@
           <w:p>
             <w:pPr>
               <w:keepNext/>
+              <w:rPr>
+                <w:rFonts w:hint="eastAsia"/>
+              </w:rPr>
             </w:pPr>
           </w:p>
         </w:tc>
@@ -1022,6 +1257,9 @@
           <w:p>
             <w:pPr>
               <w:keepNext/>
+              <w:rPr>
+                <w:rFonts w:hint="eastAsia"/>
+              </w:rPr>
             </w:pPr>
           </w:p>
         </w:tc>
@@ -1038,6 +1276,9 @@
           <w:p>
             <w:pPr>
               <w:keepNext/>
+              <w:rPr>
+                <w:rFonts w:hint="eastAsia"/>
+              </w:rPr>
             </w:pPr>
           </w:p>
         </w:tc>
@@ -1048,6 +1289,9 @@
           <w:p>
             <w:pPr>
               <w:keepNext/>
+              <w:rPr>
+                <w:rFonts w:hint="eastAsia"/>
+              </w:rPr>
             </w:pPr>
             <w:r>
               <w:rPr>
@@ -1065,6 +1309,9 @@
           <w:p>
             <w:pPr>
               <w:keepNext/>
+              <w:rPr>
+                <w:rFonts w:hint="eastAsia"/>
+              </w:rPr>
             </w:pPr>
           </w:p>
         </w:tc>
@@ -1075,6 +1322,9 @@
           <w:p>
             <w:pPr>
               <w:keepNext/>
+              <w:rPr>
+                <w:rFonts w:hint="eastAsia"/>
+              </w:rPr>
             </w:pPr>
           </w:p>
         </w:tc>
@@ -1085,6 +1335,9 @@
           <w:p>
             <w:pPr>
               <w:keepNext/>
+              <w:rPr>
+                <w:rFonts w:hint="eastAsia"/>
+              </w:rPr>
             </w:pPr>
           </w:p>
         </w:tc>
@@ -1095,6 +1348,9 @@
           <w:p>
             <w:pPr>
               <w:keepNext/>
+              <w:rPr>
+                <w:rFonts w:hint="eastAsia"/>
+              </w:rPr>
             </w:pPr>
           </w:p>
         </w:tc>
@@ -1111,6 +1367,9 @@
           <w:p>
             <w:pPr>
               <w:keepNext/>
+              <w:rPr>
+                <w:rFonts w:hint="eastAsia"/>
+              </w:rPr>
             </w:pPr>
             <w:r>
               <w:rPr>
@@ -1129,6 +1388,9 @@
           <w:p>
             <w:pPr>
               <w:keepNext/>
+              <w:rPr>
+                <w:rFonts w:hint="eastAsia"/>
+              </w:rPr>
             </w:pPr>
             <w:r>
               <w:rPr>
@@ -1146,6 +1408,9 @@
           <w:p>
             <w:pPr>
               <w:keepNext/>
+              <w:rPr>
+                <w:rFonts w:hint="eastAsia"/>
+              </w:rPr>
             </w:pPr>
           </w:p>
         </w:tc>
@@ -1156,6 +1421,9 @@
           <w:p>
             <w:pPr>
               <w:keepNext/>
+              <w:rPr>
+                <w:rFonts w:hint="eastAsia"/>
+              </w:rPr>
             </w:pPr>
           </w:p>
         </w:tc>
@@ -1166,6 +1434,9 @@
           <w:p>
             <w:pPr>
               <w:keepNext/>
+              <w:rPr>
+                <w:rFonts w:hint="eastAsia"/>
+              </w:rPr>
             </w:pPr>
           </w:p>
         </w:tc>
@@ -1176,6 +1447,9 @@
           <w:p>
             <w:pPr>
               <w:keepNext/>
+              <w:rPr>
+                <w:rFonts w:hint="eastAsia"/>
+              </w:rPr>
             </w:pPr>
           </w:p>
         </w:tc>
@@ -1192,6 +1466,9 @@
           <w:p>
             <w:pPr>
               <w:keepNext/>
+              <w:rPr>
+                <w:rFonts w:hint="eastAsia"/>
+              </w:rPr>
             </w:pPr>
           </w:p>
         </w:tc>
@@ -1202,6 +1479,9 @@
           <w:p>
             <w:pPr>
               <w:keepNext/>
+              <w:rPr>
+                <w:rFonts w:hint="eastAsia"/>
+              </w:rPr>
             </w:pPr>
             <w:r>
               <w:rPr>
@@ -1219,6 +1499,9 @@
           <w:p>
             <w:pPr>
               <w:keepNext/>
+              <w:rPr>
+                <w:rFonts w:hint="eastAsia"/>
+              </w:rPr>
             </w:pPr>
           </w:p>
         </w:tc>
@@ -1229,6 +1512,9 @@
           <w:p>
             <w:pPr>
               <w:keepNext/>
+              <w:rPr>
+                <w:rFonts w:hint="eastAsia"/>
+              </w:rPr>
             </w:pPr>
           </w:p>
         </w:tc>
@@ -1239,6 +1525,9 @@
           <w:p>
             <w:pPr>
               <w:keepNext/>
+              <w:rPr>
+                <w:rFonts w:hint="eastAsia"/>
+              </w:rPr>
             </w:pPr>
           </w:p>
         </w:tc>
@@ -1249,6 +1538,9 @@
           <w:p>
             <w:pPr>
               <w:keepNext/>
+              <w:rPr>
+                <w:rFonts w:hint="eastAsia"/>
+              </w:rPr>
             </w:pPr>
           </w:p>
         </w:tc>
@@ -1265,6 +1557,9 @@
           <w:p>
             <w:pPr>
               <w:keepNext/>
+              <w:rPr>
+                <w:rFonts w:hint="eastAsia"/>
+              </w:rPr>
             </w:pPr>
           </w:p>
         </w:tc>
@@ -1275,6 +1570,9 @@
           <w:p>
             <w:pPr>
               <w:keepNext/>
+              <w:rPr>
+                <w:rFonts w:hint="eastAsia"/>
+              </w:rPr>
             </w:pPr>
             <w:r>
               <w:rPr>
@@ -1292,6 +1590,9 @@
           <w:p>
             <w:pPr>
               <w:keepNext/>
+              <w:rPr>
+                <w:rFonts w:hint="eastAsia"/>
+              </w:rPr>
             </w:pPr>
           </w:p>
         </w:tc>
@@ -1302,6 +1603,9 @@
           <w:p>
             <w:pPr>
               <w:keepNext/>
+              <w:rPr>
+                <w:rFonts w:hint="eastAsia"/>
+              </w:rPr>
             </w:pPr>
           </w:p>
         </w:tc>
@@ -1312,6 +1616,9 @@
           <w:p>
             <w:pPr>
               <w:keepNext/>
+              <w:rPr>
+                <w:rFonts w:hint="eastAsia"/>
+              </w:rPr>
             </w:pPr>
           </w:p>
         </w:tc>
@@ -1322,6 +1629,9 @@
           <w:p>
             <w:pPr>
               <w:keepNext/>
+              <w:rPr>
+                <w:rFonts w:hint="eastAsia"/>
+              </w:rPr>
             </w:pPr>
           </w:p>
         </w:tc>
@@ -1338,6 +1648,9 @@
           <w:p>
             <w:pPr>
               <w:keepNext/>
+              <w:rPr>
+                <w:rFonts w:hint="eastAsia"/>
+              </w:rPr>
             </w:pPr>
           </w:p>
         </w:tc>
@@ -1348,6 +1661,9 @@
           <w:p>
             <w:pPr>
               <w:keepNext/>
+              <w:rPr>
+                <w:rFonts w:hint="eastAsia"/>
+              </w:rPr>
             </w:pPr>
             <w:r>
               <w:rPr>
@@ -1365,6 +1681,9 @@
           <w:p>
             <w:pPr>
               <w:keepNext/>
+              <w:rPr>
+                <w:rFonts w:hint="eastAsia"/>
+              </w:rPr>
             </w:pPr>
           </w:p>
         </w:tc>
@@ -1375,6 +1694,9 @@
           <w:p>
             <w:pPr>
               <w:keepNext/>
+              <w:rPr>
+                <w:rFonts w:hint="eastAsia"/>
+              </w:rPr>
             </w:pPr>
           </w:p>
         </w:tc>
@@ -1385,6 +1707,9 @@
           <w:p>
             <w:pPr>
               <w:keepNext/>
+              <w:rPr>
+                <w:rFonts w:hint="eastAsia"/>
+              </w:rPr>
             </w:pPr>
           </w:p>
         </w:tc>
@@ -1395,6 +1720,9 @@
           <w:p>
             <w:pPr>
               <w:keepNext/>
+              <w:rPr>
+                <w:rFonts w:hint="eastAsia"/>
+              </w:rPr>
             </w:pPr>
           </w:p>
         </w:tc>
@@ -1411,6 +1739,9 @@
           <w:p>
             <w:pPr>
               <w:keepNext/>
+              <w:rPr>
+                <w:rFonts w:hint="eastAsia"/>
+              </w:rPr>
             </w:pPr>
             <w:r>
               <w:rPr>
@@ -1429,6 +1760,9 @@
           <w:p>
             <w:pPr>
               <w:keepNext/>
+              <w:rPr>
+                <w:rFonts w:hint="eastAsia"/>
+              </w:rPr>
             </w:pPr>
             <w:r>
               <w:rPr>
@@ -1446,6 +1780,9 @@
           <w:p>
             <w:pPr>
               <w:keepNext/>
+              <w:rPr>
+                <w:rFonts w:hint="eastAsia"/>
+              </w:rPr>
             </w:pPr>
           </w:p>
         </w:tc>
@@ -1456,6 +1793,9 @@
           <w:p>
             <w:pPr>
               <w:keepNext/>
+              <w:rPr>
+                <w:rFonts w:hint="eastAsia"/>
+              </w:rPr>
             </w:pPr>
           </w:p>
         </w:tc>
@@ -1466,6 +1806,9 @@
           <w:p>
             <w:pPr>
               <w:keepNext/>
+              <w:rPr>
+                <w:rFonts w:hint="eastAsia"/>
+              </w:rPr>
             </w:pPr>
           </w:p>
         </w:tc>
@@ -1476,6 +1819,9 @@
           <w:p>
             <w:pPr>
               <w:keepNext/>
+              <w:rPr>
+                <w:rFonts w:hint="eastAsia"/>
+              </w:rPr>
             </w:pPr>
           </w:p>
         </w:tc>
@@ -1492,6 +1838,9 @@
           <w:p>
             <w:pPr>
               <w:keepNext/>
+              <w:rPr>
+                <w:rFonts w:hint="eastAsia"/>
+              </w:rPr>
             </w:pPr>
           </w:p>
         </w:tc>
@@ -1502,6 +1851,9 @@
           <w:p>
             <w:pPr>
               <w:keepNext/>
+              <w:rPr>
+                <w:rFonts w:hint="eastAsia"/>
+              </w:rPr>
             </w:pPr>
             <w:r>
               <w:rPr>
@@ -1519,6 +1871,9 @@
           <w:p>
             <w:pPr>
               <w:keepNext/>
+              <w:rPr>
+                <w:rFonts w:hint="eastAsia"/>
+              </w:rPr>
             </w:pPr>
           </w:p>
         </w:tc>
@@ -1529,6 +1884,9 @@
           <w:p>
             <w:pPr>
               <w:keepNext/>
+              <w:rPr>
+                <w:rFonts w:hint="eastAsia"/>
+              </w:rPr>
             </w:pPr>
           </w:p>
         </w:tc>
@@ -1539,6 +1897,9 @@
           <w:p>
             <w:pPr>
               <w:keepNext/>
+              <w:rPr>
+                <w:rFonts w:hint="eastAsia"/>
+              </w:rPr>
             </w:pPr>
           </w:p>
         </w:tc>
@@ -1549,6 +1910,9 @@
           <w:p>
             <w:pPr>
               <w:keepNext/>
+              <w:rPr>
+                <w:rFonts w:hint="eastAsia"/>
+              </w:rPr>
             </w:pPr>
           </w:p>
         </w:tc>
@@ -1565,6 +1929,9 @@
           <w:p>
             <w:pPr>
               <w:keepNext/>
+              <w:rPr>
+                <w:rFonts w:hint="eastAsia"/>
+              </w:rPr>
             </w:pPr>
           </w:p>
         </w:tc>
@@ -1575,6 +1942,9 @@
           <w:p>
             <w:pPr>
               <w:keepNext/>
+              <w:rPr>
+                <w:rFonts w:hint="eastAsia"/>
+              </w:rPr>
             </w:pPr>
             <w:r>
               <w:rPr>
@@ -1592,6 +1962,9 @@
           <w:p>
             <w:pPr>
               <w:keepNext/>
+              <w:rPr>
+                <w:rFonts w:hint="eastAsia"/>
+              </w:rPr>
             </w:pPr>
           </w:p>
         </w:tc>
@@ -1602,6 +1975,9 @@
           <w:p>
             <w:pPr>
               <w:keepNext/>
+              <w:rPr>
+                <w:rFonts w:hint="eastAsia"/>
+              </w:rPr>
             </w:pPr>
           </w:p>
         </w:tc>
@@ -1612,6 +1988,9 @@
           <w:p>
             <w:pPr>
               <w:keepNext/>
+              <w:rPr>
+                <w:rFonts w:hint="eastAsia"/>
+              </w:rPr>
             </w:pPr>
           </w:p>
         </w:tc>
@@ -1622,6 +2001,9 @@
           <w:p>
             <w:pPr>
               <w:keepNext/>
+              <w:rPr>
+                <w:rFonts w:hint="eastAsia"/>
+              </w:rPr>
             </w:pPr>
           </w:p>
         </w:tc>
@@ -1635,13 +2017,24 @@
           <w:tcPr>
             <w:tcW w:w="1701" w:type="dxa"/>
           </w:tcPr>
-          <w:p/>
+          <w:p>
+            <w:pPr>
+              <w:rPr>
+                <w:rFonts w:hint="eastAsia"/>
+              </w:rPr>
+            </w:pPr>
+          </w:p>
         </w:tc>
         <w:tc>
           <w:tcPr>
             <w:tcW w:w="2041" w:type="dxa"/>
           </w:tcPr>
           <w:p>
+            <w:pPr>
+              <w:rPr>
+                <w:rFonts w:hint="eastAsia"/>
+              </w:rPr>
+            </w:pPr>
             <w:r>
               <w:rPr>
                 <w:color w:val="676B5E"/>
@@ -1655,34 +2048,66 @@
           <w:tcPr>
             <w:tcW w:w="1644" w:type="dxa"/>
           </w:tcPr>
-          <w:p/>
+          <w:p>
+            <w:pPr>
+              <w:rPr>
+                <w:rFonts w:hint="eastAsia"/>
+              </w:rPr>
+            </w:pPr>
+          </w:p>
         </w:tc>
         <w:tc>
           <w:tcPr>
             <w:tcW w:w="1644" w:type="dxa"/>
           </w:tcPr>
-          <w:p/>
+          <w:p>
+            <w:pPr>
+              <w:rPr>
+                <w:rFonts w:hint="eastAsia"/>
+              </w:rPr>
+            </w:pPr>
+          </w:p>
         </w:tc>
         <w:tc>
           <w:tcPr>
             <w:tcW w:w="1474" w:type="dxa"/>
           </w:tcPr>
-          <w:p/>
+          <w:p>
+            <w:pPr>
+              <w:rPr>
+                <w:rFonts w:hint="eastAsia"/>
+              </w:rPr>
+            </w:pPr>
+          </w:p>
         </w:tc>
         <w:tc>
           <w:tcPr>
             <w:tcW w:w="1587" w:type="dxa"/>
           </w:tcPr>
-          <w:p/>
+          <w:p>
+            <w:pPr>
+              <w:rPr>
+                <w:rFonts w:hint="eastAsia"/>
+              </w:rPr>
+            </w:pPr>
+          </w:p>
         </w:tc>
       </w:tr>
     </w:tbl>
     <w:p>
       <w:pPr>
         <w:spacing w:after="20"/>
+        <w:rPr>
+          <w:rFonts w:hint="eastAsia"/>
+        </w:rPr>
       </w:pPr>
     </w:p>
     <w:p>
+      <w:pPr>
+        <w:rPr>
+          <w:rFonts w:hint="eastAsia"/>
+        </w:rPr>
+      </w:pPr>
       <w:r>
         <w:rPr>
           <w:b/>
@@ -1726,6 +2151,9 @@
           <w:p>
             <w:pPr>
               <w:keepNext/>
+              <w:rPr>
+                <w:rFonts w:hint="eastAsia"/>
+              </w:rPr>
             </w:pPr>
             <w:r>
               <w:rPr>
@@ -1745,6 +2173,9 @@
           <w:p>
             <w:pPr>
               <w:keepNext/>
+              <w:rPr>
+                <w:rFonts w:hint="eastAsia"/>
+              </w:rPr>
             </w:pPr>
             <w:r>
               <w:rPr>
@@ -1764,6 +2195,9 @@
           <w:p>
             <w:pPr>
               <w:keepNext/>
+              <w:rPr>
+                <w:rFonts w:hint="eastAsia"/>
+              </w:rPr>
             </w:pPr>
             <w:r>
               <w:rPr>
@@ -1783,6 +2217,9 @@
           <w:p>
             <w:pPr>
               <w:keepNext/>
+              <w:rPr>
+                <w:rFonts w:hint="eastAsia"/>
+              </w:rPr>
             </w:pPr>
             <w:r>
               <w:rPr>
@@ -1802,6 +2239,9 @@
           <w:p>
             <w:pPr>
               <w:keepNext/>
+              <w:rPr>
+                <w:rFonts w:hint="eastAsia"/>
+              </w:rPr>
             </w:pPr>
             <w:r>
               <w:rPr>
@@ -1821,6 +2261,9 @@
           <w:p>
             <w:pPr>
               <w:keepNext/>
+              <w:rPr>
+                <w:rFonts w:hint="eastAsia"/>
+              </w:rPr>
             </w:pPr>
             <w:r>
               <w:rPr>
@@ -1845,6 +2288,9 @@
           <w:p>
             <w:pPr>
               <w:keepNext/>
+              <w:rPr>
+                <w:rFonts w:hint="eastAsia"/>
+              </w:rPr>
             </w:pPr>
             <w:r>
               <w:rPr>
@@ -1863,6 +2309,9 @@
           <w:p>
             <w:pPr>
               <w:keepNext/>
+              <w:rPr>
+                <w:rFonts w:hint="eastAsia"/>
+              </w:rPr>
             </w:pPr>
           </w:p>
         </w:tc>
@@ -1873,6 +2322,9 @@
           <w:p>
             <w:pPr>
               <w:keepNext/>
+              <w:rPr>
+                <w:rFonts w:hint="eastAsia"/>
+              </w:rPr>
             </w:pPr>
           </w:p>
         </w:tc>
@@ -1883,6 +2335,9 @@
           <w:p>
             <w:pPr>
               <w:keepNext/>
+              <w:rPr>
+                <w:rFonts w:hint="eastAsia"/>
+              </w:rPr>
             </w:pPr>
           </w:p>
         </w:tc>
@@ -1893,6 +2348,9 @@
           <w:p>
             <w:pPr>
               <w:keepNext/>
+              <w:rPr>
+                <w:rFonts w:hint="eastAsia"/>
+              </w:rPr>
             </w:pPr>
           </w:p>
         </w:tc>
@@ -1903,6 +2361,9 @@
           <w:p>
             <w:pPr>
               <w:keepNext/>
+              <w:rPr>
+                <w:rFonts w:hint="eastAsia"/>
+              </w:rPr>
             </w:pPr>
           </w:p>
         </w:tc>
@@ -1919,6 +2380,9 @@
           <w:p>
             <w:pPr>
               <w:keepNext/>
+              <w:rPr>
+                <w:rFonts w:hint="eastAsia"/>
+              </w:rPr>
             </w:pPr>
             <w:r>
               <w:rPr>
@@ -1937,6 +2401,9 @@
           <w:p>
             <w:pPr>
               <w:keepNext/>
+              <w:rPr>
+                <w:rFonts w:hint="eastAsia"/>
+              </w:rPr>
             </w:pPr>
           </w:p>
         </w:tc>
@@ -1947,6 +2414,9 @@
           <w:p>
             <w:pPr>
               <w:keepNext/>
+              <w:rPr>
+                <w:rFonts w:hint="eastAsia"/>
+              </w:rPr>
             </w:pPr>
           </w:p>
         </w:tc>
@@ -1957,6 +2427,9 @@
           <w:p>
             <w:pPr>
               <w:keepNext/>
+              <w:rPr>
+                <w:rFonts w:hint="eastAsia"/>
+              </w:rPr>
             </w:pPr>
           </w:p>
         </w:tc>
@@ -1967,6 +2440,9 @@
           <w:p>
             <w:pPr>
               <w:keepNext/>
+              <w:rPr>
+                <w:rFonts w:hint="eastAsia"/>
+              </w:rPr>
             </w:pPr>
           </w:p>
         </w:tc>
@@ -1977,6 +2453,9 @@
           <w:p>
             <w:pPr>
               <w:keepNext/>
+              <w:rPr>
+                <w:rFonts w:hint="eastAsia"/>
+              </w:rPr>
             </w:pPr>
           </w:p>
         </w:tc>
@@ -1993,6 +2472,9 @@
           <w:p>
             <w:pPr>
               <w:keepNext/>
+              <w:rPr>
+                <w:rFonts w:hint="eastAsia"/>
+              </w:rPr>
             </w:pPr>
             <w:r>
               <w:rPr>
@@ -2011,6 +2493,9 @@
           <w:p>
             <w:pPr>
               <w:keepNext/>
+              <w:rPr>
+                <w:rFonts w:hint="eastAsia"/>
+              </w:rPr>
             </w:pPr>
           </w:p>
         </w:tc>
@@ -2021,6 +2506,9 @@
           <w:p>
             <w:pPr>
               <w:keepNext/>
+              <w:rPr>
+                <w:rFonts w:hint="eastAsia"/>
+              </w:rPr>
             </w:pPr>
           </w:p>
         </w:tc>
@@ -2031,6 +2519,9 @@
           <w:p>
             <w:pPr>
               <w:keepNext/>
+              <w:rPr>
+                <w:rFonts w:hint="eastAsia"/>
+              </w:rPr>
             </w:pPr>
           </w:p>
         </w:tc>
@@ -2041,6 +2532,9 @@
           <w:p>
             <w:pPr>
               <w:keepNext/>
+              <w:rPr>
+                <w:rFonts w:hint="eastAsia"/>
+              </w:rPr>
             </w:pPr>
           </w:p>
         </w:tc>
@@ -2051,6 +2545,9 @@
           <w:p>
             <w:pPr>
               <w:keepNext/>
+              <w:rPr>
+                <w:rFonts w:hint="eastAsia"/>
+              </w:rPr>
             </w:pPr>
           </w:p>
         </w:tc>
@@ -2067,6 +2564,9 @@
           <w:p>
             <w:pPr>
               <w:keepNext/>
+              <w:rPr>
+                <w:rFonts w:hint="eastAsia"/>
+              </w:rPr>
             </w:pPr>
             <w:r>
               <w:rPr>
@@ -2085,6 +2585,9 @@
           <w:p>
             <w:pPr>
               <w:keepNext/>
+              <w:rPr>
+                <w:rFonts w:hint="eastAsia"/>
+              </w:rPr>
             </w:pPr>
           </w:p>
         </w:tc>
@@ -2095,6 +2598,9 @@
           <w:p>
             <w:pPr>
               <w:keepNext/>
+              <w:rPr>
+                <w:rFonts w:hint="eastAsia"/>
+              </w:rPr>
             </w:pPr>
           </w:p>
         </w:tc>
@@ -2105,6 +2611,9 @@
           <w:p>
             <w:pPr>
               <w:keepNext/>
+              <w:rPr>
+                <w:rFonts w:hint="eastAsia"/>
+              </w:rPr>
             </w:pPr>
           </w:p>
         </w:tc>
@@ -2115,6 +2624,9 @@
           <w:p>
             <w:pPr>
               <w:keepNext/>
+              <w:rPr>
+                <w:rFonts w:hint="eastAsia"/>
+              </w:rPr>
             </w:pPr>
           </w:p>
         </w:tc>
@@ -2125,6 +2637,9 @@
           <w:p>
             <w:pPr>
               <w:keepNext/>
+              <w:rPr>
+                <w:rFonts w:hint="eastAsia"/>
+              </w:rPr>
             </w:pPr>
           </w:p>
         </w:tc>
@@ -2139,6 +2654,11 @@
             <w:tcW w:w="2268" w:type="dxa"/>
           </w:tcPr>
           <w:p>
+            <w:pPr>
+              <w:rPr>
+                <w:rFonts w:hint="eastAsia"/>
+              </w:rPr>
+            </w:pPr>
             <w:r>
               <w:rPr>
                 <w:b/>
@@ -2153,40 +2673,78 @@
           <w:tcPr>
             <w:tcW w:w="907" w:type="dxa"/>
           </w:tcPr>
-          <w:p/>
+          <w:p>
+            <w:pPr>
+              <w:rPr>
+                <w:rFonts w:hint="eastAsia"/>
+              </w:rPr>
+            </w:pPr>
+          </w:p>
         </w:tc>
         <w:tc>
           <w:tcPr>
             <w:tcW w:w="1361" w:type="dxa"/>
           </w:tcPr>
-          <w:p/>
+          <w:p>
+            <w:pPr>
+              <w:rPr>
+                <w:rFonts w:hint="eastAsia"/>
+              </w:rPr>
+            </w:pPr>
+          </w:p>
         </w:tc>
         <w:tc>
           <w:tcPr>
             <w:tcW w:w="1417" w:type="dxa"/>
           </w:tcPr>
-          <w:p/>
+          <w:p>
+            <w:pPr>
+              <w:rPr>
+                <w:rFonts w:hint="eastAsia"/>
+              </w:rPr>
+            </w:pPr>
+          </w:p>
         </w:tc>
         <w:tc>
           <w:tcPr>
             <w:tcW w:w="907" w:type="dxa"/>
           </w:tcPr>
-          <w:p/>
+          <w:p>
+            <w:pPr>
+              <w:rPr>
+                <w:rFonts w:hint="eastAsia"/>
+              </w:rPr>
+            </w:pPr>
+          </w:p>
         </w:tc>
         <w:tc>
           <w:tcPr>
             <w:tcW w:w="3231" w:type="dxa"/>
           </w:tcPr>
-          <w:p/>
+          <w:p>
+            <w:pPr>
+              <w:rPr>
+                <w:rFonts w:hint="eastAsia"/>
+              </w:rPr>
+            </w:pPr>
+          </w:p>
         </w:tc>
       </w:tr>
     </w:tbl>
     <w:p>
       <w:pPr>
         <w:spacing w:after="20"/>
+        <w:rPr>
+          <w:rFonts w:hint="eastAsia"/>
+        </w:rPr>
       </w:pPr>
     </w:p>
     <w:p>
+      <w:pPr>
+        <w:rPr>
+          <w:rFonts w:hint="eastAsia"/>
+        </w:rPr>
+      </w:pPr>
       <w:r>
         <w:rPr>
           <w:b/>
@@ -2228,6 +2786,9 @@
           <w:p>
             <w:pPr>
               <w:keepNext/>
+              <w:rPr>
+                <w:rFonts w:hint="eastAsia"/>
+              </w:rPr>
             </w:pPr>
             <w:r>
               <w:rPr>
@@ -2247,6 +2808,9 @@
           <w:p>
             <w:pPr>
               <w:keepNext/>
+              <w:rPr>
+                <w:rFonts w:hint="eastAsia"/>
+              </w:rPr>
             </w:pPr>
             <w:r>
               <w:rPr>
@@ -2266,6 +2830,9 @@
           <w:p>
             <w:pPr>
               <w:keepNext/>
+              <w:rPr>
+                <w:rFonts w:hint="eastAsia"/>
+              </w:rPr>
             </w:pPr>
             <w:r>
               <w:rPr>
@@ -2285,6 +2852,9 @@
           <w:p>
             <w:pPr>
               <w:keepNext/>
+              <w:rPr>
+                <w:rFonts w:hint="eastAsia"/>
+              </w:rPr>
             </w:pPr>
             <w:r>
               <w:rPr>
@@ -2306,34 +2876,66 @@
           <w:tcPr>
             <w:tcW w:w="2608" w:type="dxa"/>
           </w:tcPr>
-          <w:p/>
+          <w:p>
+            <w:pPr>
+              <w:rPr>
+                <w:rFonts w:hint="eastAsia"/>
+              </w:rPr>
+            </w:pPr>
+          </w:p>
         </w:tc>
         <w:tc>
           <w:tcPr>
             <w:tcW w:w="2381" w:type="dxa"/>
           </w:tcPr>
-          <w:p/>
+          <w:p>
+            <w:pPr>
+              <w:rPr>
+                <w:rFonts w:hint="eastAsia"/>
+              </w:rPr>
+            </w:pPr>
+          </w:p>
         </w:tc>
         <w:tc>
           <w:tcPr>
             <w:tcW w:w="2608" w:type="dxa"/>
           </w:tcPr>
-          <w:p/>
+          <w:p>
+            <w:pPr>
+              <w:rPr>
+                <w:rFonts w:hint="eastAsia"/>
+              </w:rPr>
+            </w:pPr>
+          </w:p>
         </w:tc>
         <w:tc>
           <w:tcPr>
             <w:tcW w:w="2494" w:type="dxa"/>
           </w:tcPr>
-          <w:p/>
+          <w:p>
+            <w:pPr>
+              <w:rPr>
+                <w:rFonts w:hint="eastAsia"/>
+              </w:rPr>
+            </w:pPr>
+          </w:p>
         </w:tc>
       </w:tr>
     </w:tbl>
     <w:p>
       <w:pPr>
         <w:spacing w:after="20"/>
+        <w:rPr>
+          <w:rFonts w:hint="eastAsia"/>
+        </w:rPr>
       </w:pPr>
     </w:p>
     <w:p>
+      <w:pPr>
+        <w:rPr>
+          <w:rFonts w:hint="eastAsia"/>
+        </w:rPr>
+      </w:pPr>
       <w:r>
         <w:br w:type="page"/>
       </w:r>
@@ -2341,6 +2943,9 @@
     <w:p>
       <w:pPr>
         <w:keepNext/>
+        <w:rPr>
+          <w:rFonts w:hint="eastAsia"/>
+        </w:rPr>
       </w:pPr>
       <w:r>
         <w:rPr>
@@ -2348,12 +2953,16 @@
           <w:color w:val="A64C28"/>
           <w:sz w:val="24"/>
         </w:rPr>
+        <w:lastRenderedPageBreak/>
         <w:t>C · Completa y óptima, con evidencia</w:t>
       </w:r>
     </w:p>
     <w:p>
       <w:pPr>
         <w:spacing w:after="80"/>
+        <w:rPr>
+          <w:rFonts w:hint="eastAsia"/>
+        </w:rPr>
       </w:pPr>
       <w:r>
         <w:rPr>
@@ -2390,6 +2999,9 @@
           <w:p>
             <w:pPr>
               <w:keepNext/>
+              <w:rPr>
+                <w:rFonts w:hint="eastAsia"/>
+              </w:rPr>
             </w:pPr>
             <w:r>
               <w:rPr>
@@ -2409,6 +3021,9 @@
           <w:p>
             <w:pPr>
               <w:keepNext/>
+              <w:rPr>
+                <w:rFonts w:hint="eastAsia"/>
+              </w:rPr>
             </w:pPr>
             <w:r>
               <w:rPr>
@@ -2428,6 +3043,9 @@
           <w:p>
             <w:pPr>
               <w:keepNext/>
+              <w:rPr>
+                <w:rFonts w:hint="eastAsia"/>
+              </w:rPr>
             </w:pPr>
             <w:r>
               <w:rPr>
@@ -2447,6 +3065,9 @@
           <w:p>
             <w:pPr>
               <w:keepNext/>
+              <w:rPr>
+                <w:rFonts w:hint="eastAsia"/>
+              </w:rPr>
             </w:pPr>
             <w:r>
               <w:rPr>
@@ -2466,6 +3087,9 @@
           <w:p>
             <w:pPr>
               <w:keepNext/>
+              <w:rPr>
+                <w:rFonts w:hint="eastAsia"/>
+              </w:rPr>
             </w:pPr>
             <w:r>
               <w:rPr>
@@ -2490,6 +3114,9 @@
           <w:p>
             <w:pPr>
               <w:keepNext/>
+              <w:rPr>
+                <w:rFonts w:hint="eastAsia"/>
+              </w:rPr>
             </w:pPr>
             <w:r>
               <w:rPr>
@@ -2508,6 +3135,9 @@
           <w:p>
             <w:pPr>
               <w:keepNext/>
+              <w:rPr>
+                <w:rFonts w:hint="eastAsia"/>
+              </w:rPr>
             </w:pPr>
           </w:p>
         </w:tc>
@@ -2518,6 +3148,9 @@
           <w:p>
             <w:pPr>
               <w:keepNext/>
+              <w:rPr>
+                <w:rFonts w:hint="eastAsia"/>
+              </w:rPr>
             </w:pPr>
           </w:p>
         </w:tc>
@@ -2528,6 +3161,9 @@
           <w:p>
             <w:pPr>
               <w:keepNext/>
+              <w:rPr>
+                <w:rFonts w:hint="eastAsia"/>
+              </w:rPr>
             </w:pPr>
           </w:p>
         </w:tc>
@@ -2538,6 +3174,9 @@
           <w:p>
             <w:pPr>
               <w:keepNext/>
+              <w:rPr>
+                <w:rFonts w:hint="eastAsia"/>
+              </w:rPr>
             </w:pPr>
           </w:p>
         </w:tc>
@@ -2554,6 +3193,9 @@
           <w:p>
             <w:pPr>
               <w:keepNext/>
+              <w:rPr>
+                <w:rFonts w:hint="eastAsia"/>
+              </w:rPr>
             </w:pPr>
             <w:r>
               <w:rPr>
@@ -2572,6 +3214,9 @@
           <w:p>
             <w:pPr>
               <w:keepNext/>
+              <w:rPr>
+                <w:rFonts w:hint="eastAsia"/>
+              </w:rPr>
             </w:pPr>
           </w:p>
         </w:tc>
@@ -2582,6 +3227,9 @@
           <w:p>
             <w:pPr>
               <w:keepNext/>
+              <w:rPr>
+                <w:rFonts w:hint="eastAsia"/>
+              </w:rPr>
             </w:pPr>
           </w:p>
         </w:tc>
@@ -2592,6 +3240,9 @@
           <w:p>
             <w:pPr>
               <w:keepNext/>
+              <w:rPr>
+                <w:rFonts w:hint="eastAsia"/>
+              </w:rPr>
             </w:pPr>
           </w:p>
         </w:tc>
@@ -2602,6 +3253,9 @@
           <w:p>
             <w:pPr>
               <w:keepNext/>
+              <w:rPr>
+                <w:rFonts w:hint="eastAsia"/>
+              </w:rPr>
             </w:pPr>
           </w:p>
         </w:tc>
@@ -2618,6 +3272,9 @@
           <w:p>
             <w:pPr>
               <w:keepNext/>
+              <w:rPr>
+                <w:rFonts w:hint="eastAsia"/>
+              </w:rPr>
             </w:pPr>
             <w:r>
               <w:rPr>
@@ -2636,6 +3293,9 @@
           <w:p>
             <w:pPr>
               <w:keepNext/>
+              <w:rPr>
+                <w:rFonts w:hint="eastAsia"/>
+              </w:rPr>
             </w:pPr>
           </w:p>
         </w:tc>
@@ -2646,6 +3306,9 @@
           <w:p>
             <w:pPr>
               <w:keepNext/>
+              <w:rPr>
+                <w:rFonts w:hint="eastAsia"/>
+              </w:rPr>
             </w:pPr>
           </w:p>
         </w:tc>
@@ -2656,6 +3319,9 @@
           <w:p>
             <w:pPr>
               <w:keepNext/>
+              <w:rPr>
+                <w:rFonts w:hint="eastAsia"/>
+              </w:rPr>
             </w:pPr>
           </w:p>
         </w:tc>
@@ -2666,6 +3332,9 @@
           <w:p>
             <w:pPr>
               <w:keepNext/>
+              <w:rPr>
+                <w:rFonts w:hint="eastAsia"/>
+              </w:rPr>
             </w:pPr>
           </w:p>
         </w:tc>
@@ -2680,6 +3349,11 @@
             <w:tcW w:w="1814" w:type="dxa"/>
           </w:tcPr>
           <w:p>
+            <w:pPr>
+              <w:rPr>
+                <w:rFonts w:hint="eastAsia"/>
+              </w:rPr>
+            </w:pPr>
             <w:r>
               <w:rPr>
                 <w:b/>
@@ -2694,37 +3368,67 @@
           <w:tcPr>
             <w:tcW w:w="1191" w:type="dxa"/>
           </w:tcPr>
-          <w:p/>
+          <w:p>
+            <w:pPr>
+              <w:rPr>
+                <w:rFonts w:hint="eastAsia"/>
+              </w:rPr>
+            </w:pPr>
+          </w:p>
         </w:tc>
         <w:tc>
           <w:tcPr>
             <w:tcW w:w="1304" w:type="dxa"/>
           </w:tcPr>
-          <w:p/>
+          <w:p>
+            <w:pPr>
+              <w:rPr>
+                <w:rFonts w:hint="eastAsia"/>
+              </w:rPr>
+            </w:pPr>
+          </w:p>
         </w:tc>
         <w:tc>
           <w:tcPr>
             <w:tcW w:w="1304" w:type="dxa"/>
           </w:tcPr>
-          <w:p/>
+          <w:p>
+            <w:pPr>
+              <w:rPr>
+                <w:rFonts w:hint="eastAsia"/>
+              </w:rPr>
+            </w:pPr>
+          </w:p>
         </w:tc>
         <w:tc>
           <w:tcPr>
             <w:tcW w:w="4479" w:type="dxa"/>
           </w:tcPr>
-          <w:p/>
+          <w:p>
+            <w:pPr>
+              <w:rPr>
+                <w:rFonts w:hint="eastAsia"/>
+              </w:rPr>
+            </w:pPr>
+          </w:p>
         </w:tc>
       </w:tr>
     </w:tbl>
     <w:p>
       <w:pPr>
         <w:spacing w:after="20"/>
+        <w:rPr>
+          <w:rFonts w:hint="eastAsia"/>
+        </w:rPr>
       </w:pPr>
     </w:p>
     <w:p>
       <w:pPr>
         <w:keepNext/>
         <w:spacing w:before="120"/>
+        <w:rPr>
+          <w:rFonts w:hint="eastAsia"/>
+        </w:rPr>
       </w:pPr>
       <w:r>
         <w:rPr>
@@ -2738,6 +3442,9 @@
     <w:p>
       <w:pPr>
         <w:spacing w:after="80"/>
+        <w:rPr>
+          <w:rFonts w:hint="eastAsia"/>
+        </w:rPr>
       </w:pPr>
       <w:r>
         <w:rPr>
@@ -2752,6 +3459,9 @@
       <w:pPr>
         <w:keepNext/>
         <w:spacing w:after="40"/>
+        <w:rPr>
+          <w:rFonts w:hint="eastAsia"/>
+        </w:rPr>
       </w:pPr>
       <w:r>
         <w:rPr>
@@ -2785,19 +3495,31 @@
           <w:tcPr>
             <w:tcW w:w="10091" w:type="dxa"/>
           </w:tcPr>
-          <w:p/>
+          <w:p>
+            <w:pPr>
+              <w:rPr>
+                <w:rFonts w:hint="eastAsia"/>
+              </w:rPr>
+            </w:pPr>
+          </w:p>
         </w:tc>
       </w:tr>
     </w:tbl>
     <w:p>
       <w:pPr>
         <w:spacing w:after="20"/>
+        <w:rPr>
+          <w:rFonts w:hint="eastAsia"/>
+        </w:rPr>
       </w:pPr>
     </w:p>
     <w:p>
       <w:pPr>
         <w:keepNext/>
         <w:spacing w:after="40"/>
+        <w:rPr>
+          <w:rFonts w:hint="eastAsia"/>
+        </w:rPr>
       </w:pPr>
       <w:r>
         <w:rPr>
@@ -2831,19 +3553,31 @@
           <w:tcPr>
             <w:tcW w:w="10091" w:type="dxa"/>
           </w:tcPr>
-          <w:p/>
+          <w:p>
+            <w:pPr>
+              <w:rPr>
+                <w:rFonts w:hint="eastAsia"/>
+              </w:rPr>
+            </w:pPr>
+          </w:p>
         </w:tc>
       </w:tr>
     </w:tbl>
     <w:p>
       <w:pPr>
         <w:spacing w:after="20"/>
+        <w:rPr>
+          <w:rFonts w:hint="eastAsia"/>
+        </w:rPr>
       </w:pPr>
     </w:p>
     <w:p>
       <w:pPr>
         <w:keepNext/>
         <w:spacing w:after="40"/>
+        <w:rPr>
+          <w:rFonts w:hint="eastAsia"/>
+        </w:rPr>
       </w:pPr>
       <w:r>
         <w:rPr>
@@ -2877,19 +3611,31 @@
           <w:tcPr>
             <w:tcW w:w="10091" w:type="dxa"/>
           </w:tcPr>
-          <w:p/>
+          <w:p>
+            <w:pPr>
+              <w:rPr>
+                <w:rFonts w:hint="eastAsia"/>
+              </w:rPr>
+            </w:pPr>
+          </w:p>
         </w:tc>
       </w:tr>
     </w:tbl>
     <w:p>
       <w:pPr>
         <w:spacing w:after="20"/>
+        <w:rPr>
+          <w:rFonts w:hint="eastAsia"/>
+        </w:rPr>
       </w:pPr>
     </w:p>
     <w:p>
       <w:pPr>
         <w:keepNext/>
         <w:spacing w:after="40"/>
+        <w:rPr>
+          <w:rFonts w:hint="eastAsia"/>
+        </w:rPr>
       </w:pPr>
       <w:r>
         <w:rPr>
@@ -2923,19 +3669,31 @@
           <w:tcPr>
             <w:tcW w:w="10091" w:type="dxa"/>
           </w:tcPr>
-          <w:p/>
+          <w:p>
+            <w:pPr>
+              <w:rPr>
+                <w:rFonts w:hint="eastAsia"/>
+              </w:rPr>
+            </w:pPr>
+          </w:p>
         </w:tc>
       </w:tr>
     </w:tbl>
     <w:p>
       <w:pPr>
         <w:spacing w:after="20"/>
+        <w:rPr>
+          <w:rFonts w:hint="eastAsia"/>
+        </w:rPr>
       </w:pPr>
     </w:p>
     <w:p>
       <w:pPr>
         <w:keepNext/>
         <w:spacing w:before="80"/>
+        <w:rPr>
+          <w:rFonts w:hint="eastAsia"/>
+        </w:rPr>
       </w:pPr>
       <w:r>
         <w:rPr>
@@ -2949,6 +3707,9 @@
     <w:p>
       <w:pPr>
         <w:spacing w:after="80"/>
+        <w:rPr>
+          <w:rFonts w:hint="eastAsia"/>
+        </w:rPr>
       </w:pPr>
       <w:r>
         <w:rPr>
@@ -2982,6 +3743,9 @@
           <w:p>
             <w:pPr>
               <w:keepNext/>
+              <w:rPr>
+                <w:rFonts w:hint="eastAsia"/>
+              </w:rPr>
             </w:pPr>
             <w:r>
               <w:rPr>
@@ -3001,6 +3765,9 @@
           <w:p>
             <w:pPr>
               <w:keepNext/>
+              <w:rPr>
+                <w:rFonts w:hint="eastAsia"/>
+              </w:rPr>
             </w:pPr>
             <w:r>
               <w:rPr>
@@ -3025,6 +3792,9 @@
           <w:p>
             <w:pPr>
               <w:keepNext/>
+              <w:rPr>
+                <w:rFonts w:hint="eastAsia"/>
+              </w:rPr>
             </w:pPr>
           </w:p>
         </w:tc>
@@ -3035,6 +3805,9 @@
           <w:p>
             <w:pPr>
               <w:keepNext/>
+              <w:rPr>
+                <w:rFonts w:hint="eastAsia"/>
+              </w:rPr>
             </w:pPr>
           </w:p>
         </w:tc>
@@ -3048,25 +3821,43 @@
           <w:tcPr>
             <w:tcW w:w="5046" w:type="dxa"/>
           </w:tcPr>
-          <w:p/>
+          <w:p>
+            <w:pPr>
+              <w:rPr>
+                <w:rFonts w:hint="eastAsia"/>
+              </w:rPr>
+            </w:pPr>
+          </w:p>
         </w:tc>
         <w:tc>
           <w:tcPr>
             <w:tcW w:w="5046" w:type="dxa"/>
           </w:tcPr>
-          <w:p/>
+          <w:p>
+            <w:pPr>
+              <w:rPr>
+                <w:rFonts w:hint="eastAsia"/>
+              </w:rPr>
+            </w:pPr>
+          </w:p>
         </w:tc>
       </w:tr>
     </w:tbl>
     <w:p>
       <w:pPr>
         <w:spacing w:after="20"/>
+        <w:rPr>
+          <w:rFonts w:hint="eastAsia"/>
+        </w:rPr>
       </w:pPr>
     </w:p>
     <w:p>
       <w:pPr>
         <w:keepNext/>
         <w:spacing w:before="40"/>
+        <w:rPr>
+          <w:rFonts w:hint="eastAsia"/>
+        </w:rPr>
       </w:pPr>
       <w:r>
         <w:rPr>
@@ -3080,49 +3871,89 @@
     <w:p>
       <w:pPr>
         <w:spacing w:after="20"/>
+        <w:rPr>
+          <w:rFonts w:hint="eastAsia"/>
+        </w:rPr>
       </w:pPr>
       <w:r>
         <w:rPr>
           <w:color w:val="272921"/>
           <w:sz w:val="19"/>
         </w:rPr>
-        <w:t>☐  La parte A tiene hora y no tiene borrones de después.</w:t>
+        <w:t>☐</w:t>
+      </w:r>
+      <w:r>
+        <w:rPr>
+          <w:color w:val="272921"/>
+          <w:sz w:val="19"/>
+        </w:rPr>
+        <w:t xml:space="preserve">  La parte A tiene hora y no tiene borrones de después.</w:t>
       </w:r>
     </w:p>
     <w:p>
       <w:pPr>
         <w:spacing w:after="20"/>
+        <w:rPr>
+          <w:rFonts w:hint="eastAsia"/>
+        </w:rPr>
       </w:pPr>
       <w:r>
         <w:rPr>
           <w:color w:val="272921"/>
           <w:sz w:val="19"/>
         </w:rPr>
-        <w:t>☐  Las tablas B tienen números, no palabras; las corridas que no llegaron dicen dónde quedaron.</w:t>
+        <w:t>☐</w:t>
+      </w:r>
+      <w:r>
+        <w:rPr>
+          <w:color w:val="272921"/>
+          <w:sz w:val="19"/>
+        </w:rPr>
+        <w:t xml:space="preserve">  Las tablas B tienen números, no palabras; las corridas que no llegaron dicen dónde quedaron.</w:t>
       </w:r>
     </w:p>
     <w:p>
       <w:pPr>
         <w:spacing w:after="20"/>
+        <w:rPr>
+          <w:rFonts w:hint="eastAsia"/>
+        </w:rPr>
       </w:pPr>
       <w:r>
         <w:rPr>
           <w:color w:val="272921"/>
           <w:sz w:val="19"/>
         </w:rPr>
-        <w:t>☐  Cada respuesta de la parte D empieza con un número de su tabla.</w:t>
+        <w:t>☐</w:t>
+      </w:r>
+      <w:r>
+        <w:rPr>
+          <w:color w:val="272921"/>
+          <w:sz w:val="19"/>
+        </w:rPr>
+        <w:t xml:space="preserve">  Cada respuesta de la parte D empieza con un número de su tabla.</w:t>
       </w:r>
     </w:p>
     <w:p>
       <w:pPr>
         <w:spacing w:after="20"/>
+        <w:rPr>
+          <w:rFonts w:hint="eastAsia"/>
+        </w:rPr>
       </w:pPr>
       <w:r>
         <w:rPr>
           <w:color w:val="272921"/>
           <w:sz w:val="19"/>
         </w:rPr>
-        <w:t>☐  Al final del PDF va la captura del «Registro de corridas» de la simulación.</w:t>
+        <w:t>☐</w:t>
+      </w:r>
+      <w:r>
+        <w:rPr>
+          <w:color w:val="272921"/>
+          <w:sz w:val="19"/>
+        </w:rPr>
+        <w:t xml:space="preserve">  Al final del PDF va la captura del «Registro de corridas» de la simulación.</w:t>
       </w:r>
     </w:p>
     <w:sectPr>
@@ -3308,31 +4139,31 @@
       </w:rPr>
     </w:lvl>
   </w:abstractNum>
-  <w:num w:numId="1" w16cid:durableId="1462109058">
+  <w:num w:numId="1" w16cid:durableId="740447033">
     <w:abstractNumId w:val="8"/>
   </w:num>
-  <w:num w:numId="2" w16cid:durableId="19358197">
+  <w:num w:numId="2" w16cid:durableId="57368754">
     <w:abstractNumId w:val="6"/>
   </w:num>
-  <w:num w:numId="3" w16cid:durableId="1434328250">
+  <w:num w:numId="3" w16cid:durableId="625047012">
     <w:abstractNumId w:val="5"/>
   </w:num>
-  <w:num w:numId="4" w16cid:durableId="609237180">
+  <w:num w:numId="4" w16cid:durableId="1779644552">
     <w:abstractNumId w:val="4"/>
   </w:num>
-  <w:num w:numId="5" w16cid:durableId="1198155526">
+  <w:num w:numId="5" w16cid:durableId="1139806292">
     <w:abstractNumId w:val="7"/>
   </w:num>
-  <w:num w:numId="6" w16cid:durableId="1623069810">
+  <w:num w:numId="6" w16cid:durableId="186649289">
     <w:abstractNumId w:val="3"/>
   </w:num>
-  <w:num w:numId="7" w16cid:durableId="1838837738">
+  <w:num w:numId="7" w16cid:durableId="1603340993">
     <w:abstractNumId w:val="2"/>
   </w:num>
-  <w:num w:numId="8" w16cid:durableId="1465853684">
+  <w:num w:numId="8" w16cid:durableId="572012503">
     <w:abstractNumId w:val="1"/>
   </w:num>
-  <w:num w:numId="9" w16cid:durableId="1031032151">
+  <w:num w:numId="9" w16cid:durableId="1896578397">
     <w:abstractNumId w:val="0"/>
   </w:num>
 </w:numbering>

</xml_diff>